<commit_message>
Initial commit — Studio Roast order app
</commit_message>
<xml_diff>
--- a/StudioRoast_Architecture.docx
+++ b/StudioRoast_Architecture.docx
@@ -15181,7 +15181,7 @@
           <w:sz w:val="22"/>
           <w:szCs w:val="22"/>
         </w:rPr>
-        <w:t xml:space="preserve">Railway.app is the recommended free deployment platform. The repository includes a railway.json configuration file:</w:t>
+        <w:t xml:space="preserve">Railway.app is the recommended free deployment platform. The repository includes a railway.json configuration file that Railway reads automatically:</w:t>
       </w:r>
     </w:p>
     <w:p>
@@ -15386,10 +15386,27 @@
     </w:p>
     <w:p>
       <w:pPr>
-        <w:spacing w:before="0" w:after="100"/>
+        <w:spacing w:before="0" w:after="120"/>
       </w:pPr>
       <w:r>
         <w:t xml:space="preserve"/>
+      </w:r>
+    </w:p>
+    <w:p>
+      <w:pPr>
+        <w:pStyle w:val="Heading3"/>
+        <w:spacing w:before="200" w:after="80"/>
+      </w:pPr>
+      <w:r>
+        <w:rPr>
+          <w:rFonts w:ascii="Arial" w:cs="Arial" w:eastAsia="Arial" w:hAnsi="Arial"/>
+          <w:b/>
+          <w:bCs/>
+          <w:color w:val="3B1F0D"/>
+          <w:sz w:val="22"/>
+          <w:szCs w:val="22"/>
+        </w:rPr>
+        <w:t xml:space="preserve">Step 1 — Create a Railway Account</w:t>
       </w:r>
     </w:p>
     <w:p>
@@ -15403,7 +15420,565 @@
           <w:sz w:val="22"/>
           <w:szCs w:val="22"/>
         </w:rPr>
-        <w:t xml:space="preserve">Deployment steps:</w:t>
+        <w:t xml:space="preserve">Go to railway.app and sign up using your GitHub account. This allows Railway to access your repositories directly.</w:t>
+      </w:r>
+    </w:p>
+    <w:p>
+      <w:pPr>
+        <w:spacing w:before="0" w:after="80"/>
+      </w:pPr>
+      <w:r>
+        <w:t xml:space="preserve"/>
+      </w:r>
+    </w:p>
+    <w:p>
+      <w:pPr>
+        <w:pStyle w:val="Heading3"/>
+        <w:spacing w:before="200" w:after="80"/>
+      </w:pPr>
+      <w:r>
+        <w:rPr>
+          <w:rFonts w:ascii="Arial" w:cs="Arial" w:eastAsia="Arial" w:hAnsi="Arial"/>
+          <w:b/>
+          <w:bCs/>
+          <w:color w:val="3B1F0D"/>
+          <w:sz w:val="22"/>
+          <w:szCs w:val="22"/>
+        </w:rPr>
+        <w:t xml:space="preserve">Step 2 — Create a New Project from GitHub</w:t>
+      </w:r>
+    </w:p>
+    <w:p>
+      <w:pPr>
+        <w:spacing w:before="0" w:after="100"/>
+      </w:pPr>
+      <w:r>
+        <w:rPr>
+          <w:rFonts w:ascii="Arial" w:cs="Arial" w:eastAsia="Arial" w:hAnsi="Arial"/>
+          <w:color w:val="1A1A1A"/>
+          <w:sz w:val="22"/>
+          <w:szCs w:val="22"/>
+        </w:rPr>
+        <w:t xml:space="preserve">Click "New Project" → "Deploy from GitHub repo" → select samdanikouser/food-order-app. Railway will prompt for four pieces of information:</w:t>
+      </w:r>
+    </w:p>
+    <w:p>
+      <w:pPr>
+        <w:spacing w:before="0" w:after="80"/>
+      </w:pPr>
+      <w:r>
+        <w:t xml:space="preserve"/>
+      </w:r>
+    </w:p>
+    <w:tbl>
+      <w:tblPr>
+        <w:tblW w:type="dxa" w:w="9360"/>
+        <w:tblBorders>
+          <w:top w:val="single" w:color="auto" w:sz="4"/>
+          <w:left w:val="single" w:color="auto" w:sz="4"/>
+          <w:bottom w:val="single" w:color="auto" w:sz="4"/>
+          <w:right w:val="single" w:color="auto" w:sz="4"/>
+          <w:insideH w:val="single" w:color="auto" w:sz="4"/>
+          <w:insideV w:val="single" w:color="auto" w:sz="4"/>
+        </w:tblBorders>
+      </w:tblPr>
+      <w:tblGrid>
+        <w:gridCol w:w="2800"/>
+        <w:gridCol w:w="2800"/>
+        <w:gridCol w:w="3760"/>
+      </w:tblGrid>
+      <w:tr>
+        <w:trPr>
+          <w:tblHeader/>
+        </w:trPr>
+        <w:tc>
+          <w:tcPr>
+            <w:tcW w:type="dxa" w:w="2800"/>
+            <w:tcBorders>
+              <w:top w:val="single" w:color="DDDDDD" w:sz="1"/>
+              <w:left w:val="single" w:color="DDDDDD" w:sz="1"/>
+              <w:bottom w:val="single" w:color="DDDDDD" w:sz="1"/>
+              <w:right w:val="single" w:color="DDDDDD" w:sz="1"/>
+            </w:tcBorders>
+            <w:shd w:fill="3B1F0D" w:val="clear"/>
+            <w:tcMar>
+              <w:top w:type="dxa" w:w="100"/>
+              <w:left w:type="dxa" w:w="140"/>
+              <w:bottom w:type="dxa" w:w="100"/>
+              <w:right w:type="dxa" w:w="140"/>
+            </w:tcMar>
+          </w:tcPr>
+          <w:p>
+            <w:r>
+              <w:rPr>
+                <w:rFonts w:ascii="Arial" w:cs="Arial" w:eastAsia="Arial" w:hAnsi="Arial"/>
+                <w:b/>
+                <w:bCs/>
+                <w:color w:val="FFFFFF"/>
+                <w:sz w:val="20"/>
+                <w:szCs w:val="20"/>
+              </w:rPr>
+              <w:t xml:space="preserve">Field</w:t>
+            </w:r>
+          </w:p>
+        </w:tc>
+        <w:tc>
+          <w:tcPr>
+            <w:tcW w:type="dxa" w:w="2800"/>
+            <w:tcBorders>
+              <w:top w:val="single" w:color="DDDDDD" w:sz="1"/>
+              <w:left w:val="single" w:color="DDDDDD" w:sz="1"/>
+              <w:bottom w:val="single" w:color="DDDDDD" w:sz="1"/>
+              <w:right w:val="single" w:color="DDDDDD" w:sz="1"/>
+            </w:tcBorders>
+            <w:shd w:fill="3B1F0D" w:val="clear"/>
+            <w:tcMar>
+              <w:top w:type="dxa" w:w="100"/>
+              <w:left w:type="dxa" w:w="140"/>
+              <w:bottom w:type="dxa" w:w="100"/>
+              <w:right w:type="dxa" w:w="140"/>
+            </w:tcMar>
+          </w:tcPr>
+          <w:p>
+            <w:r>
+              <w:rPr>
+                <w:rFonts w:ascii="Arial" w:cs="Arial" w:eastAsia="Arial" w:hAnsi="Arial"/>
+                <w:b/>
+                <w:bCs/>
+                <w:color w:val="FFFFFF"/>
+                <w:sz w:val="20"/>
+                <w:szCs w:val="20"/>
+              </w:rPr>
+              <w:t xml:space="preserve">Value to Enter</w:t>
+            </w:r>
+          </w:p>
+        </w:tc>
+        <w:tc>
+          <w:tcPr>
+            <w:tcW w:type="dxa" w:w="3760"/>
+            <w:tcBorders>
+              <w:top w:val="single" w:color="DDDDDD" w:sz="1"/>
+              <w:left w:val="single" w:color="DDDDDD" w:sz="1"/>
+              <w:bottom w:val="single" w:color="DDDDDD" w:sz="1"/>
+              <w:right w:val="single" w:color="DDDDDD" w:sz="1"/>
+            </w:tcBorders>
+            <w:shd w:fill="3B1F0D" w:val="clear"/>
+            <w:tcMar>
+              <w:top w:type="dxa" w:w="100"/>
+              <w:left w:type="dxa" w:w="140"/>
+              <w:bottom w:type="dxa" w:w="100"/>
+              <w:right w:type="dxa" w:w="140"/>
+            </w:tcMar>
+          </w:tcPr>
+          <w:p>
+            <w:r>
+              <w:rPr>
+                <w:rFonts w:ascii="Arial" w:cs="Arial" w:eastAsia="Arial" w:hAnsi="Arial"/>
+                <w:b/>
+                <w:bCs/>
+                <w:color w:val="FFFFFF"/>
+                <w:sz w:val="20"/>
+                <w:szCs w:val="20"/>
+              </w:rPr>
+              <w:t xml:space="preserve">Notes</w:t>
+            </w:r>
+          </w:p>
+        </w:tc>
+      </w:tr>
+      <w:tr>
+        <w:tc>
+          <w:tcPr>
+            <w:tcW w:type="dxa" w:w="2800"/>
+            <w:tcBorders>
+              <w:top w:val="single" w:color="DDDDDD" w:sz="1"/>
+              <w:left w:val="single" w:color="DDDDDD" w:sz="1"/>
+              <w:bottom w:val="single" w:color="DDDDDD" w:sz="1"/>
+              <w:right w:val="single" w:color="DDDDDD" w:sz="1"/>
+            </w:tcBorders>
+            <w:shd w:fill="FFFFFF" w:val="clear"/>
+            <w:tcMar>
+              <w:top w:type="dxa" w:w="80"/>
+              <w:left w:type="dxa" w:w="140"/>
+              <w:bottom w:type="dxa" w:w="80"/>
+              <w:right w:type="dxa" w:w="140"/>
+            </w:tcMar>
+          </w:tcPr>
+          <w:p>
+            <w:r>
+              <w:rPr>
+                <w:rFonts w:ascii="Arial" w:cs="Arial" w:eastAsia="Arial" w:hAnsi="Arial"/>
+                <w:color w:val="1A1A1A"/>
+                <w:sz w:val="20"/>
+                <w:szCs w:val="20"/>
+              </w:rPr>
+              <w:t xml:space="preserve">GitHub repository</w:t>
+            </w:r>
+          </w:p>
+        </w:tc>
+        <w:tc>
+          <w:tcPr>
+            <w:tcW w:type="dxa" w:w="2800"/>
+            <w:tcBorders>
+              <w:top w:val="single" w:color="DDDDDD" w:sz="1"/>
+              <w:left w:val="single" w:color="DDDDDD" w:sz="1"/>
+              <w:bottom w:val="single" w:color="DDDDDD" w:sz="1"/>
+              <w:right w:val="single" w:color="DDDDDD" w:sz="1"/>
+            </w:tcBorders>
+            <w:shd w:fill="FFFFFF" w:val="clear"/>
+            <w:tcMar>
+              <w:top w:type="dxa" w:w="80"/>
+              <w:left w:type="dxa" w:w="140"/>
+              <w:bottom w:type="dxa" w:w="80"/>
+              <w:right w:type="dxa" w:w="140"/>
+            </w:tcMar>
+          </w:tcPr>
+          <w:p>
+            <w:r>
+              <w:rPr>
+                <w:rFonts w:ascii="Arial" w:cs="Arial" w:eastAsia="Arial" w:hAnsi="Arial"/>
+                <w:color w:val="1A1A1A"/>
+                <w:sz w:val="20"/>
+                <w:szCs w:val="20"/>
+              </w:rPr>
+              <w:t xml:space="preserve">samdanikouser/food-order-app</w:t>
+            </w:r>
+          </w:p>
+        </w:tc>
+        <w:tc>
+          <w:tcPr>
+            <w:tcW w:type="dxa" w:w="3760"/>
+            <w:tcBorders>
+              <w:top w:val="single" w:color="DDDDDD" w:sz="1"/>
+              <w:left w:val="single" w:color="DDDDDD" w:sz="1"/>
+              <w:bottom w:val="single" w:color="DDDDDD" w:sz="1"/>
+              <w:right w:val="single" w:color="DDDDDD" w:sz="1"/>
+            </w:tcBorders>
+            <w:shd w:fill="FFFFFF" w:val="clear"/>
+            <w:tcMar>
+              <w:top w:type="dxa" w:w="80"/>
+              <w:left w:type="dxa" w:w="140"/>
+              <w:bottom w:type="dxa" w:w="80"/>
+              <w:right w:type="dxa" w:w="140"/>
+            </w:tcMar>
+          </w:tcPr>
+          <w:p>
+            <w:r>
+              <w:rPr>
+                <w:rFonts w:ascii="Arial" w:cs="Arial" w:eastAsia="Arial" w:hAnsi="Arial"/>
+                <w:color w:val="1A1A1A"/>
+                <w:sz w:val="20"/>
+                <w:szCs w:val="20"/>
+              </w:rPr>
+              <w:t xml:space="preserve">owner/repo format</w:t>
+            </w:r>
+          </w:p>
+        </w:tc>
+      </w:tr>
+      <w:tr>
+        <w:tc>
+          <w:tcPr>
+            <w:tcW w:type="dxa" w:w="2800"/>
+            <w:tcBorders>
+              <w:top w:val="single" w:color="DDDDDD" w:sz="1"/>
+              <w:left w:val="single" w:color="DDDDDD" w:sz="1"/>
+              <w:bottom w:val="single" w:color="DDDDDD" w:sz="1"/>
+              <w:right w:val="single" w:color="DDDDDD" w:sz="1"/>
+            </w:tcBorders>
+            <w:shd w:fill="FDF6EC" w:val="clear"/>
+            <w:tcMar>
+              <w:top w:type="dxa" w:w="80"/>
+              <w:left w:type="dxa" w:w="140"/>
+              <w:bottom w:type="dxa" w:w="80"/>
+              <w:right w:type="dxa" w:w="140"/>
+            </w:tcMar>
+          </w:tcPr>
+          <w:p>
+            <w:r>
+              <w:rPr>
+                <w:rFonts w:ascii="Arial" w:cs="Arial" w:eastAsia="Arial" w:hAnsi="Arial"/>
+                <w:color w:val="1A1A1A"/>
+                <w:sz w:val="20"/>
+                <w:szCs w:val="20"/>
+              </w:rPr>
+              <w:t xml:space="preserve">Branch</w:t>
+            </w:r>
+          </w:p>
+        </w:tc>
+        <w:tc>
+          <w:tcPr>
+            <w:tcW w:type="dxa" w:w="2800"/>
+            <w:tcBorders>
+              <w:top w:val="single" w:color="DDDDDD" w:sz="1"/>
+              <w:left w:val="single" w:color="DDDDDD" w:sz="1"/>
+              <w:bottom w:val="single" w:color="DDDDDD" w:sz="1"/>
+              <w:right w:val="single" w:color="DDDDDD" w:sz="1"/>
+            </w:tcBorders>
+            <w:shd w:fill="FDF6EC" w:val="clear"/>
+            <w:tcMar>
+              <w:top w:type="dxa" w:w="80"/>
+              <w:left w:type="dxa" w:w="140"/>
+              <w:bottom w:type="dxa" w:w="80"/>
+              <w:right w:type="dxa" w:w="140"/>
+            </w:tcMar>
+          </w:tcPr>
+          <w:p>
+            <w:r>
+              <w:rPr>
+                <w:rFonts w:ascii="Arial" w:cs="Arial" w:eastAsia="Arial" w:hAnsi="Arial"/>
+                <w:color w:val="1A1A1A"/>
+                <w:sz w:val="20"/>
+                <w:szCs w:val="20"/>
+              </w:rPr>
+              <w:t xml:space="preserve">main</w:t>
+            </w:r>
+          </w:p>
+        </w:tc>
+        <w:tc>
+          <w:tcPr>
+            <w:tcW w:type="dxa" w:w="3760"/>
+            <w:tcBorders>
+              <w:top w:val="single" w:color="DDDDDD" w:sz="1"/>
+              <w:left w:val="single" w:color="DDDDDD" w:sz="1"/>
+              <w:bottom w:val="single" w:color="DDDDDD" w:sz="1"/>
+              <w:right w:val="single" w:color="DDDDDD" w:sz="1"/>
+            </w:tcBorders>
+            <w:shd w:fill="FDF6EC" w:val="clear"/>
+            <w:tcMar>
+              <w:top w:type="dxa" w:w="80"/>
+              <w:left w:type="dxa" w:w="140"/>
+              <w:bottom w:type="dxa" w:w="80"/>
+              <w:right w:type="dxa" w:w="140"/>
+            </w:tcMar>
+          </w:tcPr>
+          <w:p>
+            <w:r>
+              <w:rPr>
+                <w:rFonts w:ascii="Arial" w:cs="Arial" w:eastAsia="Arial" w:hAnsi="Arial"/>
+                <w:color w:val="1A1A1A"/>
+                <w:sz w:val="20"/>
+                <w:szCs w:val="20"/>
+              </w:rPr>
+              <w:t xml:space="preserve">Default branch</w:t>
+            </w:r>
+          </w:p>
+        </w:tc>
+      </w:tr>
+      <w:tr>
+        <w:tc>
+          <w:tcPr>
+            <w:tcW w:type="dxa" w:w="2800"/>
+            <w:tcBorders>
+              <w:top w:val="single" w:color="DDDDDD" w:sz="1"/>
+              <w:left w:val="single" w:color="DDDDDD" w:sz="1"/>
+              <w:bottom w:val="single" w:color="DDDDDD" w:sz="1"/>
+              <w:right w:val="single" w:color="DDDDDD" w:sz="1"/>
+            </w:tcBorders>
+            <w:shd w:fill="FFFFFF" w:val="clear"/>
+            <w:tcMar>
+              <w:top w:type="dxa" w:w="80"/>
+              <w:left w:type="dxa" w:w="140"/>
+              <w:bottom w:type="dxa" w:w="80"/>
+              <w:right w:type="dxa" w:w="140"/>
+            </w:tcMar>
+          </w:tcPr>
+          <w:p>
+            <w:r>
+              <w:rPr>
+                <w:rFonts w:ascii="Arial" w:cs="Arial" w:eastAsia="Arial" w:hAnsi="Arial"/>
+                <w:color w:val="1A1A1A"/>
+                <w:sz w:val="20"/>
+                <w:szCs w:val="20"/>
+              </w:rPr>
+              <w:t xml:space="preserve">Service name</w:t>
+            </w:r>
+          </w:p>
+        </w:tc>
+        <w:tc>
+          <w:tcPr>
+            <w:tcW w:type="dxa" w:w="2800"/>
+            <w:tcBorders>
+              <w:top w:val="single" w:color="DDDDDD" w:sz="1"/>
+              <w:left w:val="single" w:color="DDDDDD" w:sz="1"/>
+              <w:bottom w:val="single" w:color="DDDDDD" w:sz="1"/>
+              <w:right w:val="single" w:color="DDDDDD" w:sz="1"/>
+            </w:tcBorders>
+            <w:shd w:fill="FFFFFF" w:val="clear"/>
+            <w:tcMar>
+              <w:top w:type="dxa" w:w="80"/>
+              <w:left w:type="dxa" w:w="140"/>
+              <w:bottom w:type="dxa" w:w="80"/>
+              <w:right w:type="dxa" w:w="140"/>
+            </w:tcMar>
+          </w:tcPr>
+          <w:p>
+            <w:r>
+              <w:rPr>
+                <w:rFonts w:ascii="Arial" w:cs="Arial" w:eastAsia="Arial" w:hAnsi="Arial"/>
+                <w:color w:val="1A1A1A"/>
+                <w:sz w:val="20"/>
+                <w:szCs w:val="20"/>
+              </w:rPr>
+              <w:t xml:space="preserve">studio-roast</w:t>
+            </w:r>
+          </w:p>
+        </w:tc>
+        <w:tc>
+          <w:tcPr>
+            <w:tcW w:type="dxa" w:w="3760"/>
+            <w:tcBorders>
+              <w:top w:val="single" w:color="DDDDDD" w:sz="1"/>
+              <w:left w:val="single" w:color="DDDDDD" w:sz="1"/>
+              <w:bottom w:val="single" w:color="DDDDDD" w:sz="1"/>
+              <w:right w:val="single" w:color="DDDDDD" w:sz="1"/>
+            </w:tcBorders>
+            <w:shd w:fill="FFFFFF" w:val="clear"/>
+            <w:tcMar>
+              <w:top w:type="dxa" w:w="80"/>
+              <w:left w:type="dxa" w:w="140"/>
+              <w:bottom w:type="dxa" w:w="80"/>
+              <w:right w:type="dxa" w:w="140"/>
+            </w:tcMar>
+          </w:tcPr>
+          <w:p>
+            <w:r>
+              <w:rPr>
+                <w:rFonts w:ascii="Arial" w:cs="Arial" w:eastAsia="Arial" w:hAnsi="Arial"/>
+                <w:color w:val="1A1A1A"/>
+                <w:sz w:val="20"/>
+                <w:szCs w:val="20"/>
+              </w:rPr>
+              <w:t xml:space="preserve">Label shown inside Railway dashboard</w:t>
+            </w:r>
+          </w:p>
+        </w:tc>
+      </w:tr>
+      <w:tr>
+        <w:tc>
+          <w:tcPr>
+            <w:tcW w:type="dxa" w:w="2800"/>
+            <w:tcBorders>
+              <w:top w:val="single" w:color="DDDDDD" w:sz="1"/>
+              <w:left w:val="single" w:color="DDDDDD" w:sz="1"/>
+              <w:bottom w:val="single" w:color="DDDDDD" w:sz="1"/>
+              <w:right w:val="single" w:color="DDDDDD" w:sz="1"/>
+            </w:tcBorders>
+            <w:shd w:fill="FDF6EC" w:val="clear"/>
+            <w:tcMar>
+              <w:top w:type="dxa" w:w="80"/>
+              <w:left w:type="dxa" w:w="140"/>
+              <w:bottom w:type="dxa" w:w="80"/>
+              <w:right w:type="dxa" w:w="140"/>
+            </w:tcMar>
+          </w:tcPr>
+          <w:p>
+            <w:r>
+              <w:rPr>
+                <w:rFonts w:ascii="Arial" w:cs="Arial" w:eastAsia="Arial" w:hAnsi="Arial"/>
+                <w:color w:val="1A1A1A"/>
+                <w:sz w:val="20"/>
+                <w:szCs w:val="20"/>
+              </w:rPr>
+              <w:t xml:space="preserve">Deploy from</w:t>
+            </w:r>
+          </w:p>
+        </w:tc>
+        <w:tc>
+          <w:tcPr>
+            <w:tcW w:type="dxa" w:w="2800"/>
+            <w:tcBorders>
+              <w:top w:val="single" w:color="DDDDDD" w:sz="1"/>
+              <w:left w:val="single" w:color="DDDDDD" w:sz="1"/>
+              <w:bottom w:val="single" w:color="DDDDDD" w:sz="1"/>
+              <w:right w:val="single" w:color="DDDDDD" w:sz="1"/>
+            </w:tcBorders>
+            <w:shd w:fill="FDF6EC" w:val="clear"/>
+            <w:tcMar>
+              <w:top w:type="dxa" w:w="80"/>
+              <w:left w:type="dxa" w:w="140"/>
+              <w:bottom w:type="dxa" w:w="80"/>
+              <w:right w:type="dxa" w:w="140"/>
+            </w:tcMar>
+          </w:tcPr>
+          <w:p>
+            <w:r>
+              <w:rPr>
+                <w:rFonts w:ascii="Arial" w:cs="Arial" w:eastAsia="Arial" w:hAnsi="Arial"/>
+                <w:color w:val="1A1A1A"/>
+                <w:sz w:val="20"/>
+                <w:szCs w:val="20"/>
+              </w:rPr>
+              <w:t xml:space="preserve">Source code (Railpack)</w:t>
+            </w:r>
+          </w:p>
+        </w:tc>
+        <w:tc>
+          <w:tcPr>
+            <w:tcW w:type="dxa" w:w="3760"/>
+            <w:tcBorders>
+              <w:top w:val="single" w:color="DDDDDD" w:sz="1"/>
+              <w:left w:val="single" w:color="DDDDDD" w:sz="1"/>
+              <w:bottom w:val="single" w:color="DDDDDD" w:sz="1"/>
+              <w:right w:val="single" w:color="DDDDDD" w:sz="1"/>
+            </w:tcBorders>
+            <w:shd w:fill="FDF6EC" w:val="clear"/>
+            <w:tcMar>
+              <w:top w:type="dxa" w:w="80"/>
+              <w:left w:type="dxa" w:w="140"/>
+              <w:bottom w:type="dxa" w:w="80"/>
+              <w:right w:type="dxa" w:w="140"/>
+            </w:tcMar>
+          </w:tcPr>
+          <w:p>
+            <w:r>
+              <w:rPr>
+                <w:rFonts w:ascii="Arial" w:cs="Arial" w:eastAsia="Arial" w:hAnsi="Arial"/>
+                <w:color w:val="1A1A1A"/>
+                <w:sz w:val="20"/>
+                <w:szCs w:val="20"/>
+              </w:rPr>
+              <w:t xml:space="preserve">NOT a Docker image — Railway builds from source using railway.json</w:t>
+            </w:r>
+          </w:p>
+        </w:tc>
+      </w:tr>
+    </w:tbl>
+    <w:p>
+      <w:pPr>
+        <w:spacing w:before="0" w:after="120"/>
+      </w:pPr>
+      <w:r>
+        <w:t xml:space="preserve"/>
+      </w:r>
+    </w:p>
+    <w:p>
+      <w:pPr>
+        <w:pStyle w:val="Heading3"/>
+        <w:spacing w:before="200" w:after="80"/>
+      </w:pPr>
+      <w:r>
+        <w:rPr>
+          <w:rFonts w:ascii="Arial" w:cs="Arial" w:eastAsia="Arial" w:hAnsi="Arial"/>
+          <w:b/>
+          <w:bCs/>
+          <w:color w:val="3B1F0D"/>
+          <w:sz w:val="22"/>
+          <w:szCs w:val="22"/>
+        </w:rPr>
+        <w:t xml:space="preserve">Step 3 — Add a Persistent Volume (Critical for SQLite)</w:t>
+      </w:r>
+    </w:p>
+    <w:p>
+      <w:pPr>
+        <w:spacing w:before="0" w:after="100"/>
+      </w:pPr>
+      <w:r>
+        <w:rPr>
+          <w:rFonts w:ascii="Arial" w:cs="Arial" w:eastAsia="Arial" w:hAnsi="Arial"/>
+          <w:color w:val="1A1A1A"/>
+          <w:sz w:val="22"/>
+          <w:szCs w:val="22"/>
+        </w:rPr>
+        <w:t xml:space="preserve">Without a persistent volume, the SQLite database file is deleted every time you redeploy, wiping all orders and settings.</w:t>
       </w:r>
     </w:p>
     <w:p>
@@ -15422,7 +15997,7 @@
           <w:sz w:val="22"/>
           <w:szCs w:val="22"/>
         </w:rPr>
-        <w:t xml:space="preserve">Push the project to a GitHub repository</w:t>
+        <w:t xml:space="preserve">In your Railway project, click "New" → "Volume"</w:t>
       </w:r>
     </w:p>
     <w:p>
@@ -15441,7 +16016,7 @@
           <w:sz w:val="22"/>
           <w:szCs w:val="22"/>
         </w:rPr>
-        <w:t xml:space="preserve">Create a new project on railway.app and connect your GitHub repo</w:t>
+        <w:t xml:space="preserve">Attach the volume to your studio-roast service</w:t>
       </w:r>
     </w:p>
     <w:p>
@@ -15460,7 +16035,7 @@
           <w:sz w:val="22"/>
           <w:szCs w:val="22"/>
         </w:rPr>
-        <w:t xml:space="preserve">Railway auto-detects railway.json and runs the build command</w:t>
+        <w:t xml:space="preserve">Set the mount path to /data</w:t>
       </w:r>
     </w:p>
     <w:p>
@@ -15479,17 +16054,20 @@
           <w:sz w:val="22"/>
           <w:szCs w:val="22"/>
         </w:rPr>
-        <w:t xml:space="preserve">Add a persistent volume and set RAILWAY_VOLUME_MOUNT_PATH to the mount path (prevents SQLite data loss on redeploys)</w:t>
-      </w:r>
-    </w:p>
-    <w:p>
-      <w:pPr>
-        <w:pStyle w:val="ListParagraph"/>
-        <w:numPr>
-          <w:ilvl w:val="0"/>
-          <w:numId w:val="3"/>
-        </w:numPr>
+        <w:t xml:space="preserve">Go to your service → Variables tab → add: RAILWAY_VOLUME_MOUNT_PATH = /data</w:t>
+      </w:r>
+    </w:p>
+    <w:p>
+      <w:pPr>
         <w:spacing w:before="0" w:after="80"/>
+      </w:pPr>
+      <w:r>
+        <w:t xml:space="preserve"/>
+      </w:r>
+    </w:p>
+    <w:p>
+      <w:pPr>
+        <w:spacing w:before="0" w:after="100"/>
       </w:pPr>
       <w:r>
         <w:rPr>
@@ -15498,7 +16076,124 @@
           <w:sz w:val="22"/>
           <w:szCs w:val="22"/>
         </w:rPr>
-        <w:t xml:space="preserve">Optionally set a custom domain in Railway's network settings</w:t>
+        <w:t xml:space="preserve">The backend reads this environment variable to know where to store food_orders.db. All data will now survive redeploys.</w:t>
+      </w:r>
+    </w:p>
+    <w:p>
+      <w:pPr>
+        <w:spacing w:before="0" w:after="100"/>
+      </w:pPr>
+      <w:r>
+        <w:t xml:space="preserve"/>
+      </w:r>
+    </w:p>
+    <w:p>
+      <w:pPr>
+        <w:pStyle w:val="Heading3"/>
+        <w:spacing w:before="200" w:after="80"/>
+      </w:pPr>
+      <w:r>
+        <w:rPr>
+          <w:rFonts w:ascii="Arial" w:cs="Arial" w:eastAsia="Arial" w:hAnsi="Arial"/>
+          <w:b/>
+          <w:bCs/>
+          <w:color w:val="3B1F0D"/>
+          <w:sz w:val="22"/>
+          <w:szCs w:val="22"/>
+        </w:rPr>
+        <w:t xml:space="preserve">Step 4 — Generate a Public URL</w:t>
+      </w:r>
+    </w:p>
+    <w:p>
+      <w:pPr>
+        <w:spacing w:before="0" w:after="100"/>
+      </w:pPr>
+      <w:r>
+        <w:rPr>
+          <w:rFonts w:ascii="Arial" w:cs="Arial" w:eastAsia="Arial" w:hAnsi="Arial"/>
+          <w:color w:val="1A1A1A"/>
+          <w:sz w:val="22"/>
+          <w:szCs w:val="22"/>
+        </w:rPr>
+        <w:t xml:space="preserve">Go to your service → Settings tab → Networking → click "Generate Domain". Railway provides a free URL in the format: studio-roast.up.railway.app. This is the URL you share with your team.</w:t>
+      </w:r>
+    </w:p>
+    <w:p>
+      <w:pPr>
+        <w:spacing w:before="0" w:after="100"/>
+      </w:pPr>
+      <w:r>
+        <w:t xml:space="preserve"/>
+      </w:r>
+    </w:p>
+    <w:p>
+      <w:pPr>
+        <w:pStyle w:val="Heading3"/>
+        <w:spacing w:before="200" w:after="80"/>
+      </w:pPr>
+      <w:r>
+        <w:rPr>
+          <w:rFonts w:ascii="Arial" w:cs="Arial" w:eastAsia="Arial" w:hAnsi="Arial"/>
+          <w:b/>
+          <w:bCs/>
+          <w:color w:val="3B1F0D"/>
+          <w:sz w:val="22"/>
+          <w:szCs w:val="22"/>
+        </w:rPr>
+        <w:t xml:space="preserve">Step 5 — Install as a PWA on Mobile</w:t>
+      </w:r>
+    </w:p>
+    <w:p>
+      <w:pPr>
+        <w:spacing w:before="0" w:after="100"/>
+      </w:pPr>
+      <w:r>
+        <w:rPr>
+          <w:rFonts w:ascii="Arial" w:cs="Arial" w:eastAsia="Arial" w:hAnsi="Arial"/>
+          <w:color w:val="1A1A1A"/>
+          <w:sz w:val="22"/>
+          <w:szCs w:val="22"/>
+        </w:rPr>
+        <w:t xml:space="preserve">Open the Railway URL on any phone browser. On Android (Chrome): tap the three-dot menu → "Add to Home Screen". On iPhone (Safari): tap Share → "Add to Home Screen". The app installs with the Studio Roast icon and launches in full-screen mode.</w:t>
+      </w:r>
+    </w:p>
+    <w:p>
+      <w:pPr>
+        <w:spacing w:before="0" w:after="100"/>
+      </w:pPr>
+      <w:r>
+        <w:t xml:space="preserve"/>
+      </w:r>
+    </w:p>
+    <w:p>
+      <w:pPr>
+        <w:pStyle w:val="Heading3"/>
+        <w:spacing w:before="200" w:after="80"/>
+      </w:pPr>
+      <w:r>
+        <w:rPr>
+          <w:rFonts w:ascii="Arial" w:cs="Arial" w:eastAsia="Arial" w:hAnsi="Arial"/>
+          <w:b/>
+          <w:bCs/>
+          <w:color w:val="3B1F0D"/>
+          <w:sz w:val="22"/>
+          <w:szCs w:val="22"/>
+        </w:rPr>
+        <w:t xml:space="preserve">Automatic Redeploys</w:t>
+      </w:r>
+    </w:p>
+    <w:p>
+      <w:pPr>
+        <w:spacing w:before="0" w:after="100"/>
+      </w:pPr>
+      <w:r>
+        <w:rPr>
+          <w:rFonts w:ascii="Arial" w:cs="Arial" w:eastAsia="Arial" w:hAnsi="Arial"/>
+          <w:color w:val="1A1A1A"/>
+          <w:sz w:val="22"/>
+          <w:szCs w:val="22"/>
+        </w:rPr>
+        <w:t xml:space="preserve">Every time you push a new commit to the main branch on GitHub, Railway automatically rebuilds and redeploys the app. No manual steps needed after the initial setup.</w:t>
       </w:r>
     </w:p>
     <w:p>

</xml_diff>